<commit_message>
Bring the complete, current SyllabusMind build into this repo
The syllabusmind/ tree here was frozen at an earlier snapshot (commit
fc977d9), missing persist.ts, report.ts, insights.ts, notice.ts,
recommend.ts, edgeTone.ts, 9 of 11 test files, and every fix from the two
most recent audit rounds (the reopenCount cap, the source audit-trail
field, the offline-simulation toggle, the correct-answer contradiction
guard). Replaced it wholesale with the current build.

Verified green in THIS checkout, not assumed from the other repo: npm
install, then npx vitest run (11 files / 124 tests, all passing),
npx tsc --noEmit (clean), and npx vite build (succeeds) all run inside
this repo's own syllabusmind/ before this commit.

Excluded: node_modules/, dist/, .env.local (holds a real API key).

Co-Authored-By: Claude Sonnet 5 <noreply@anthropic.com>
</commit_message>
<xml_diff>
--- a/syllabusmind/docs/SyllabusMind-Progress-Report.docx
+++ b/syllabusmind/docs/SyllabusMind-Progress-Report.docx
@@ -129,7 +129,7 @@
           <w:sz w:val="22"/>
           <w:szCs w:val="22"/>
         </w:rPr>
-        <w:t xml:space="preserve">39 automated tests pass, </w:t>
+        <w:t xml:space="preserve">93 automated tests pass, </w:t>
       </w:r>
       <w:r>
         <w:rPr>
@@ -604,7 +604,7 @@
                 <w:sz w:val="20"/>
                 <w:szCs w:val="20"/>
               </w:rPr>
-              <w:t xml:space="preserve">One fixed 14-node DBMS graph, no upload, no extraction, no propagation, no saved sessions, one model.</w:t>
+              <w:t xml:space="preserve">One fixed 14-node DBMS graph, no upload, no extraction, no propagation, one model. Saved progress per student was added afterwards.</w:t>
             </w:r>
           </w:p>
         </w:tc>
@@ -939,7 +939,7 @@
                 <w:sz w:val="20"/>
                 <w:szCs w:val="20"/>
               </w:rPr>
-              <w:t xml:space="preserve">Root at the centre, one ring per prerequisite depth, curved edges, node size by number of children, larger anchored root. Every state has a colour and a shape. Hover gives a glow and a tooltip such as "Weak, 1 of 2 correct". Positions are pinned so the map never rearranges.</w:t>
+              <w:t xml:space="preserve">Root at the centre with wide spacing between levels and curved links. Mastery is the dominant signal. Assessed topics are filled with their state colour plus a glyph; unchecked topics are a flat pale grey that recedes. The thickness of a solid ring shows how much evidence backs the score, node size shows how much builds on the topic so hubs look like hubs, and a badge shows right over answered. A soft red or green tint sits behind clusters of weak or strong topics, links take the colour of the states at both ends (red when both need work), confident mistakes pulse, and the recommended topic is marked on the map itself. The selected topic glows and everything two hops away fades. A progress donut and compact legend are pinned in the corners, labels avoid nodes and badges, and the map fits its container with zoom and fit controls.</w:t>
             </w:r>
           </w:p>
         </w:tc>
@@ -1005,7 +1005,7 @@
                 <w:sz w:val="20"/>
                 <w:szCs w:val="20"/>
               </w:rPr>
-              <w:t xml:space="preserve">Root diagnostic</w:t>
+              <w:t xml:space="preserve">Results page</w:t>
             </w:r>
           </w:p>
         </w:tc>
@@ -1037,7 +1037,7 @@
                 <w:sz w:val="20"/>
                 <w:szCs w:val="20"/>
               </w:rPr>
-              <w:t xml:space="preserve">Two questions per topic, walking from db_fundamentals outward. The next topics are generated ahead of the student so there is little waiting.</w:t>
+              <w:t xml:space="preserve">A KPI strip of four compact tiles in one row (need work, developing, strong, confident mistakes), tinted in their mastery colours, with the weakest topic named in the subtitle. The sample size has one home, a coverage alert with a donut that says how much to trust the result. Sections run red to green with a coloured left edge, empty groups collapse to one slim row with a lighter caption and encouraging copy, every score is a donut of the same size and stroke, and the evidence is a labelled citation block with a coloured rule. Bordered buttons are for actions (Evidence, Export, Go deeper); navigation is a quiet link.</w:t>
             </w:r>
           </w:p>
         </w:tc>
@@ -1069,7 +1069,7 @@
                 <w:sz w:val="20"/>
                 <w:szCs w:val="20"/>
               </w:rPr>
-              <w:t xml:space="preserve">src/screens/Diagnostic.tsx, src/store/useApp.ts</w:t>
+              <w:t xml:space="preserve">src/screens/Report.tsx, src/lib/report.ts</w:t>
             </w:r>
           </w:p>
         </w:tc>
@@ -1103,7 +1103,7 @@
                 <w:sz w:val="20"/>
                 <w:szCs w:val="20"/>
               </w:rPr>
-              <w:t xml:space="preserve">Go deeper</w:t>
+              <w:t xml:space="preserve">Question screens</w:t>
             </w:r>
           </w:p>
         </w:tc>
@@ -1135,7 +1135,7 @@
                 <w:sz w:val="20"/>
                 <w:szCs w:val="20"/>
               </w:rPr>
-              <w:t xml:space="preserve">One model call per click produces six to ten fresh questions on the chosen topic, using its one-hop neighbours only as context. Nothing is cached, so a repeat run gives different questions. Difficulty rises after a right answer and falls after a wrong one.</w:t>
+              <w:t xml:space="preserve">The question takes about 72 percent of the width beside a slim map, or the map can be hidden. One header holds the stepper and a single Exit to map action. Answer options have letter badges, hover and selected states, and correct or wrong feedback; confidence is a segmented control; Submit is the same blue as every primary action and grey until an answer is picked. No internal tags (level, source, fallback) are shown. The sidebar map marks the tested topic with animated rings and a Testing now tag and has no legend.</w:t>
             </w:r>
           </w:p>
         </w:tc>
@@ -1167,7 +1167,7 @@
                 <w:sz w:val="20"/>
                 <w:szCs w:val="20"/>
               </w:rPr>
-              <w:t xml:space="preserve">src/lib/questions.ts, src/screens/DeepDive.tsx</w:t>
+              <w:t xml:space="preserve">src/components/QuestionCard.tsx, src/screens/Diagnostic.tsx</w:t>
             </w:r>
           </w:p>
         </w:tc>
@@ -1201,7 +1201,7 @@
                 <w:sz w:val="20"/>
                 <w:szCs w:val="20"/>
               </w:rPr>
-              <w:t xml:space="preserve">Misconception tagging</w:t>
+              <w:t xml:space="preserve">Shared components</w:t>
             </w:r>
           </w:p>
         </w:tc>
@@ -1233,7 +1233,7 @@
                 <w:sz w:val="20"/>
                 <w:szCs w:val="20"/>
               </w:rPr>
-              <w:t xml:space="preserve">Each wrong option carries a misconception id and a plain-words belief, shown as "likely belief" in the evidence trail and the outcome.</w:t>
+              <w:t xml:space="preserve">One primary button, one alert (info, warning, success, danger), one choice and segmented control, one progress bar and one card style, defined once and used on every screen.</w:t>
             </w:r>
           </w:p>
         </w:tc>
@@ -1265,7 +1265,7 @@
                 <w:sz w:val="20"/>
                 <w:szCs w:val="20"/>
               </w:rPr>
-              <w:t xml:space="preserve">src/lib/questions.ts, src/lib/evidence.ts</w:t>
+              <w:t xml:space="preserve">src/components/ui.tsx, src/index.css</w:t>
             </w:r>
           </w:p>
         </w:tc>
@@ -1299,7 +1299,7 @@
                 <w:sz w:val="20"/>
                 <w:szCs w:val="20"/>
               </w:rPr>
-              <w:t xml:space="preserve">Outcome screen</w:t>
+              <w:t xml:space="preserve">Home screen</w:t>
             </w:r>
           </w:p>
         </w:tc>
@@ -1331,7 +1331,7 @@
                 <w:sz w:val="20"/>
                 <w:szCs w:val="20"/>
               </w:rPr>
-              <w:t xml:space="preserve">Ranks weak and shaky topics (weak first, then topics that more others build on), lists confident-wrong topics separately, shows a one-line reason per topic from the evidence trail, and links each back into a deep-dive.</w:t>
+              <w:t xml:space="preserve">One primary action, a progress summary, a recommended next topic, map or list view, unit filters, and a topic panel with prerequisites, what the topic unlocks, and the likely cause when it needs work.</w:t>
             </w:r>
           </w:p>
         </w:tc>
@@ -1363,7 +1363,7 @@
                 <w:sz w:val="20"/>
                 <w:szCs w:val="20"/>
               </w:rPr>
-              <w:t xml:space="preserve">src/screens/Report.tsx</w:t>
+              <w:t xml:space="preserve">src/screens/GraphHome.tsx, src/lib/recommend.ts</w:t>
             </w:r>
           </w:p>
         </w:tc>
@@ -1397,7 +1397,7 @@
                 <w:sz w:val="20"/>
                 <w:szCs w:val="20"/>
               </w:rPr>
-              <w:t xml:space="preserve">Scoring engine</w:t>
+              <w:t xml:space="preserve">Root diagnostic</w:t>
             </w:r>
           </w:p>
         </w:tc>
@@ -1429,7 +1429,7 @@
                 <w:sz w:val="20"/>
                 <w:szCs w:val="20"/>
               </w:rPr>
-              <w:t xml:space="preserve">Beta mastery update weighted by confidence and question level. States: unknown, tentative, weak, shaky, solid, verified, plus a danger overlay. No model ever returns a score or a state.</w:t>
+              <w:t xml:space="preserve">Two questions per topic, walking from db_fundamentals outward. The next topics are generated ahead of the student so there is little waiting.</w:t>
             </w:r>
           </w:p>
         </w:tc>
@@ -1461,7 +1461,7 @@
                 <w:sz w:val="20"/>
                 <w:szCs w:val="20"/>
               </w:rPr>
-              <w:t xml:space="preserve">src/engine/mastery.ts</w:t>
+              <w:t xml:space="preserve">src/screens/Diagnostic.tsx, src/store/useApp.ts</w:t>
             </w:r>
           </w:p>
         </w:tc>
@@ -1495,7 +1495,7 @@
                 <w:sz w:val="20"/>
                 <w:szCs w:val="20"/>
               </w:rPr>
-              <w:t xml:space="preserve">Backward loop</w:t>
+              <w:t xml:space="preserve">Go deeper</w:t>
             </w:r>
           </w:p>
         </w:tc>
@@ -1527,7 +1527,7 @@
                 <w:sz w:val="20"/>
                 <w:szCs w:val="20"/>
               </w:rPr>
-              <w:t xml:space="preserve">A wrong answer to the discriminating contrast question on a topic that looked solid reopens it: banner, log entry, down-weight, and a cap at Shaky until it passes a contrast check. The check is a plain comparison against the stored key.</w:t>
+              <w:t xml:space="preserve">One model call per click produces six to ten fresh questions on the chosen topic, using its one-hop neighbours only as context. Nothing is cached, so a repeat run gives different questions. Difficulty rises after a right answer and falls after a wrong one.</w:t>
             </w:r>
           </w:p>
         </w:tc>
@@ -1559,7 +1559,7 @@
                 <w:sz w:val="20"/>
                 <w:szCs w:val="20"/>
               </w:rPr>
-              <w:t xml:space="preserve">src/engine/mastery.ts, src/store/useApp.ts</w:t>
+              <w:t xml:space="preserve">src/lib/questions.ts, src/screens/DeepDive.tsx</w:t>
             </w:r>
           </w:p>
         </w:tc>
@@ -1593,7 +1593,7 @@
                 <w:sz w:val="20"/>
                 <w:szCs w:val="20"/>
               </w:rPr>
-              <w:t xml:space="preserve">Backup and rehearsed sets</w:t>
+              <w:t xml:space="preserve">Misconception tagging</w:t>
             </w:r>
           </w:p>
         </w:tc>
@@ -1625,7 +1625,7 @@
                 <w:sz w:val="20"/>
                 <w:szCs w:val="20"/>
               </w:rPr>
-              <w:t xml:space="preserve">Pre-written questions for all 14 topics used only if live generation fails. Concurrency Control and Query Optimization always end on a pre-written contrast pair so the demo moment never depends on the network.</w:t>
+              <w:t xml:space="preserve">Each wrong option carries a misconception id and a plain-words belief, shown as "likely belief" in the evidence trail and the outcome.</w:t>
             </w:r>
           </w:p>
         </w:tc>
@@ -1657,7 +1657,7 @@
                 <w:sz w:val="20"/>
                 <w:szCs w:val="20"/>
               </w:rPr>
-              <w:t xml:space="preserve">src/lib/backup.ts</w:t>
+              <w:t xml:space="preserve">src/lib/questions.ts, src/lib/evidence.ts</w:t>
             </w:r>
           </w:p>
         </w:tc>
@@ -1691,6 +1691,398 @@
                 <w:sz w:val="20"/>
                 <w:szCs w:val="20"/>
               </w:rPr>
+              <w:t xml:space="preserve">Outcome screen</w:t>
+            </w:r>
+          </w:p>
+        </w:tc>
+        <w:tc>
+          <w:tcPr>
+            <w:tcW w:type="dxa" w:w="4300"/>
+            <w:tcBorders>
+              <w:top w:val="single" w:color="D9D6CC" w:sz="4"/>
+              <w:left w:val="single" w:color="D9D6CC" w:sz="4"/>
+              <w:bottom w:val="single" w:color="D9D6CC" w:sz="4"/>
+              <w:right w:val="single" w:color="D9D6CC" w:sz="4"/>
+            </w:tcBorders>
+            <w:tcMar>
+              <w:top w:type="dxa" w:w="70"/>
+              <w:left w:type="dxa" w:w="110"/>
+              <w:bottom w:type="dxa" w:w="70"/>
+              <w:right w:type="dxa" w:w="110"/>
+            </w:tcMar>
+          </w:tcPr>
+          <w:p>
+            <w:pPr>
+              <w:spacing w:after="0" w:line="264"/>
+            </w:pPr>
+            <w:r>
+              <w:rPr>
+                <w:rFonts w:ascii="Calibri" w:cs="Calibri" w:eastAsia="Calibri" w:hAnsi="Calibri"/>
+                <w:b w:val="false"/>
+                <w:bCs w:val="false"/>
+                <w:sz w:val="20"/>
+                <w:szCs w:val="20"/>
+              </w:rPr>
+              <w:t xml:space="preserve">Ranks weak and shaky topics (weak first, then topics that more others build on), lists confident-wrong topics separately, shows a one-line reason per topic from the evidence trail, and links each back into a deep-dive.</w:t>
+            </w:r>
+          </w:p>
+        </w:tc>
+        <w:tc>
+          <w:tcPr>
+            <w:tcW w:type="dxa" w:w="2560"/>
+            <w:tcBorders>
+              <w:top w:val="single" w:color="D9D6CC" w:sz="4"/>
+              <w:left w:val="single" w:color="D9D6CC" w:sz="4"/>
+              <w:bottom w:val="single" w:color="D9D6CC" w:sz="4"/>
+              <w:right w:val="single" w:color="D9D6CC" w:sz="4"/>
+            </w:tcBorders>
+            <w:tcMar>
+              <w:top w:type="dxa" w:w="70"/>
+              <w:left w:type="dxa" w:w="110"/>
+              <w:bottom w:type="dxa" w:w="70"/>
+              <w:right w:type="dxa" w:w="110"/>
+            </w:tcMar>
+          </w:tcPr>
+          <w:p>
+            <w:pPr>
+              <w:spacing w:after="0" w:line="264"/>
+            </w:pPr>
+            <w:r>
+              <w:rPr>
+                <w:rFonts w:ascii="Calibri" w:cs="Calibri" w:eastAsia="Calibri" w:hAnsi="Calibri"/>
+                <w:b w:val="false"/>
+                <w:bCs w:val="false"/>
+                <w:sz w:val="20"/>
+                <w:szCs w:val="20"/>
+              </w:rPr>
+              <w:t xml:space="preserve">src/screens/Report.tsx</w:t>
+            </w:r>
+          </w:p>
+        </w:tc>
+      </w:tr>
+      <w:tr>
+        <w:tc>
+          <w:tcPr>
+            <w:tcW w:type="dxa" w:w="2500"/>
+            <w:tcBorders>
+              <w:top w:val="single" w:color="D9D6CC" w:sz="4"/>
+              <w:left w:val="single" w:color="D9D6CC" w:sz="4"/>
+              <w:bottom w:val="single" w:color="D9D6CC" w:sz="4"/>
+              <w:right w:val="single" w:color="D9D6CC" w:sz="4"/>
+            </w:tcBorders>
+            <w:tcMar>
+              <w:top w:type="dxa" w:w="70"/>
+              <w:left w:type="dxa" w:w="110"/>
+              <w:bottom w:type="dxa" w:w="70"/>
+              <w:right w:type="dxa" w:w="110"/>
+            </w:tcMar>
+          </w:tcPr>
+          <w:p>
+            <w:pPr>
+              <w:spacing w:after="0" w:line="264"/>
+            </w:pPr>
+            <w:r>
+              <w:rPr>
+                <w:rFonts w:ascii="Calibri" w:cs="Calibri" w:eastAsia="Calibri" w:hAnsi="Calibri"/>
+                <w:b w:val="false"/>
+                <w:bCs w:val="false"/>
+                <w:sz w:val="20"/>
+                <w:szCs w:val="20"/>
+              </w:rPr>
+              <w:t xml:space="preserve">Scoring engine</w:t>
+            </w:r>
+          </w:p>
+        </w:tc>
+        <w:tc>
+          <w:tcPr>
+            <w:tcW w:type="dxa" w:w="4300"/>
+            <w:tcBorders>
+              <w:top w:val="single" w:color="D9D6CC" w:sz="4"/>
+              <w:left w:val="single" w:color="D9D6CC" w:sz="4"/>
+              <w:bottom w:val="single" w:color="D9D6CC" w:sz="4"/>
+              <w:right w:val="single" w:color="D9D6CC" w:sz="4"/>
+            </w:tcBorders>
+            <w:tcMar>
+              <w:top w:type="dxa" w:w="70"/>
+              <w:left w:type="dxa" w:w="110"/>
+              <w:bottom w:type="dxa" w:w="70"/>
+              <w:right w:type="dxa" w:w="110"/>
+            </w:tcMar>
+          </w:tcPr>
+          <w:p>
+            <w:pPr>
+              <w:spacing w:after="0" w:line="264"/>
+            </w:pPr>
+            <w:r>
+              <w:rPr>
+                <w:rFonts w:ascii="Calibri" w:cs="Calibri" w:eastAsia="Calibri" w:hAnsi="Calibri"/>
+                <w:b w:val="false"/>
+                <w:bCs w:val="false"/>
+                <w:sz w:val="20"/>
+                <w:szCs w:val="20"/>
+              </w:rPr>
+              <w:t xml:space="preserve">Beta mastery update weighted by confidence and question level. States: unknown, tentative, weak, shaky, solid, verified, plus a danger overlay. No model ever returns a score or a state.</w:t>
+            </w:r>
+          </w:p>
+        </w:tc>
+        <w:tc>
+          <w:tcPr>
+            <w:tcW w:type="dxa" w:w="2560"/>
+            <w:tcBorders>
+              <w:top w:val="single" w:color="D9D6CC" w:sz="4"/>
+              <w:left w:val="single" w:color="D9D6CC" w:sz="4"/>
+              <w:bottom w:val="single" w:color="D9D6CC" w:sz="4"/>
+              <w:right w:val="single" w:color="D9D6CC" w:sz="4"/>
+            </w:tcBorders>
+            <w:tcMar>
+              <w:top w:type="dxa" w:w="70"/>
+              <w:left w:type="dxa" w:w="110"/>
+              <w:bottom w:type="dxa" w:w="70"/>
+              <w:right w:type="dxa" w:w="110"/>
+            </w:tcMar>
+          </w:tcPr>
+          <w:p>
+            <w:pPr>
+              <w:spacing w:after="0" w:line="264"/>
+            </w:pPr>
+            <w:r>
+              <w:rPr>
+                <w:rFonts w:ascii="Calibri" w:cs="Calibri" w:eastAsia="Calibri" w:hAnsi="Calibri"/>
+                <w:b w:val="false"/>
+                <w:bCs w:val="false"/>
+                <w:sz w:val="20"/>
+                <w:szCs w:val="20"/>
+              </w:rPr>
+              <w:t xml:space="preserve">src/engine/mastery.ts</w:t>
+            </w:r>
+          </w:p>
+        </w:tc>
+      </w:tr>
+      <w:tr>
+        <w:tc>
+          <w:tcPr>
+            <w:tcW w:type="dxa" w:w="2500"/>
+            <w:tcBorders>
+              <w:top w:val="single" w:color="D9D6CC" w:sz="4"/>
+              <w:left w:val="single" w:color="D9D6CC" w:sz="4"/>
+              <w:bottom w:val="single" w:color="D9D6CC" w:sz="4"/>
+              <w:right w:val="single" w:color="D9D6CC" w:sz="4"/>
+            </w:tcBorders>
+            <w:tcMar>
+              <w:top w:type="dxa" w:w="70"/>
+              <w:left w:type="dxa" w:w="110"/>
+              <w:bottom w:type="dxa" w:w="70"/>
+              <w:right w:type="dxa" w:w="110"/>
+            </w:tcMar>
+          </w:tcPr>
+          <w:p>
+            <w:pPr>
+              <w:spacing w:after="0" w:line="264"/>
+            </w:pPr>
+            <w:r>
+              <w:rPr>
+                <w:rFonts w:ascii="Calibri" w:cs="Calibri" w:eastAsia="Calibri" w:hAnsi="Calibri"/>
+                <w:b w:val="false"/>
+                <w:bCs w:val="false"/>
+                <w:sz w:val="20"/>
+                <w:szCs w:val="20"/>
+              </w:rPr>
+              <w:t xml:space="preserve">Backward loop</w:t>
+            </w:r>
+          </w:p>
+        </w:tc>
+        <w:tc>
+          <w:tcPr>
+            <w:tcW w:type="dxa" w:w="4300"/>
+            <w:tcBorders>
+              <w:top w:val="single" w:color="D9D6CC" w:sz="4"/>
+              <w:left w:val="single" w:color="D9D6CC" w:sz="4"/>
+              <w:bottom w:val="single" w:color="D9D6CC" w:sz="4"/>
+              <w:right w:val="single" w:color="D9D6CC" w:sz="4"/>
+            </w:tcBorders>
+            <w:tcMar>
+              <w:top w:type="dxa" w:w="70"/>
+              <w:left w:type="dxa" w:w="110"/>
+              <w:bottom w:type="dxa" w:w="70"/>
+              <w:right w:type="dxa" w:w="110"/>
+            </w:tcMar>
+          </w:tcPr>
+          <w:p>
+            <w:pPr>
+              <w:spacing w:after="0" w:line="264"/>
+            </w:pPr>
+            <w:r>
+              <w:rPr>
+                <w:rFonts w:ascii="Calibri" w:cs="Calibri" w:eastAsia="Calibri" w:hAnsi="Calibri"/>
+                <w:b w:val="false"/>
+                <w:bCs w:val="false"/>
+                <w:sz w:val="20"/>
+                <w:szCs w:val="20"/>
+              </w:rPr>
+              <w:t xml:space="preserve">A wrong answer to the discriminating contrast question on a topic that looked solid reopens it: banner, log entry, down-weight, and a cap at Shaky until it passes a contrast check. The check is a plain comparison against the stored key.</w:t>
+            </w:r>
+          </w:p>
+        </w:tc>
+        <w:tc>
+          <w:tcPr>
+            <w:tcW w:type="dxa" w:w="2560"/>
+            <w:tcBorders>
+              <w:top w:val="single" w:color="D9D6CC" w:sz="4"/>
+              <w:left w:val="single" w:color="D9D6CC" w:sz="4"/>
+              <w:bottom w:val="single" w:color="D9D6CC" w:sz="4"/>
+              <w:right w:val="single" w:color="D9D6CC" w:sz="4"/>
+            </w:tcBorders>
+            <w:tcMar>
+              <w:top w:type="dxa" w:w="70"/>
+              <w:left w:type="dxa" w:w="110"/>
+              <w:bottom w:type="dxa" w:w="70"/>
+              <w:right w:type="dxa" w:w="110"/>
+            </w:tcMar>
+          </w:tcPr>
+          <w:p>
+            <w:pPr>
+              <w:spacing w:after="0" w:line="264"/>
+            </w:pPr>
+            <w:r>
+              <w:rPr>
+                <w:rFonts w:ascii="Calibri" w:cs="Calibri" w:eastAsia="Calibri" w:hAnsi="Calibri"/>
+                <w:b w:val="false"/>
+                <w:bCs w:val="false"/>
+                <w:sz w:val="20"/>
+                <w:szCs w:val="20"/>
+              </w:rPr>
+              <w:t xml:space="preserve">src/engine/mastery.ts, src/store/useApp.ts</w:t>
+            </w:r>
+          </w:p>
+        </w:tc>
+      </w:tr>
+      <w:tr>
+        <w:tc>
+          <w:tcPr>
+            <w:tcW w:type="dxa" w:w="2500"/>
+            <w:tcBorders>
+              <w:top w:val="single" w:color="D9D6CC" w:sz="4"/>
+              <w:left w:val="single" w:color="D9D6CC" w:sz="4"/>
+              <w:bottom w:val="single" w:color="D9D6CC" w:sz="4"/>
+              <w:right w:val="single" w:color="D9D6CC" w:sz="4"/>
+            </w:tcBorders>
+            <w:tcMar>
+              <w:top w:type="dxa" w:w="70"/>
+              <w:left w:type="dxa" w:w="110"/>
+              <w:bottom w:type="dxa" w:w="70"/>
+              <w:right w:type="dxa" w:w="110"/>
+            </w:tcMar>
+          </w:tcPr>
+          <w:p>
+            <w:pPr>
+              <w:spacing w:after="0" w:line="264"/>
+            </w:pPr>
+            <w:r>
+              <w:rPr>
+                <w:rFonts w:ascii="Calibri" w:cs="Calibri" w:eastAsia="Calibri" w:hAnsi="Calibri"/>
+                <w:b w:val="false"/>
+                <w:bCs w:val="false"/>
+                <w:sz w:val="20"/>
+                <w:szCs w:val="20"/>
+              </w:rPr>
+              <w:t xml:space="preserve">Backup and rehearsed sets</w:t>
+            </w:r>
+          </w:p>
+        </w:tc>
+        <w:tc>
+          <w:tcPr>
+            <w:tcW w:type="dxa" w:w="4300"/>
+            <w:tcBorders>
+              <w:top w:val="single" w:color="D9D6CC" w:sz="4"/>
+              <w:left w:val="single" w:color="D9D6CC" w:sz="4"/>
+              <w:bottom w:val="single" w:color="D9D6CC" w:sz="4"/>
+              <w:right w:val="single" w:color="D9D6CC" w:sz="4"/>
+            </w:tcBorders>
+            <w:tcMar>
+              <w:top w:type="dxa" w:w="70"/>
+              <w:left w:type="dxa" w:w="110"/>
+              <w:bottom w:type="dxa" w:w="70"/>
+              <w:right w:type="dxa" w:w="110"/>
+            </w:tcMar>
+          </w:tcPr>
+          <w:p>
+            <w:pPr>
+              <w:spacing w:after="0" w:line="264"/>
+            </w:pPr>
+            <w:r>
+              <w:rPr>
+                <w:rFonts w:ascii="Calibri" w:cs="Calibri" w:eastAsia="Calibri" w:hAnsi="Calibri"/>
+                <w:b w:val="false"/>
+                <w:bCs w:val="false"/>
+                <w:sz w:val="20"/>
+                <w:szCs w:val="20"/>
+              </w:rPr>
+              <w:t xml:space="preserve">Pre-written questions for all 14 topics used only if live generation fails. Concurrency Control and Query Optimization always end on a pre-written contrast pair so the demo moment never depends on the network.</w:t>
+            </w:r>
+          </w:p>
+        </w:tc>
+        <w:tc>
+          <w:tcPr>
+            <w:tcW w:type="dxa" w:w="2560"/>
+            <w:tcBorders>
+              <w:top w:val="single" w:color="D9D6CC" w:sz="4"/>
+              <w:left w:val="single" w:color="D9D6CC" w:sz="4"/>
+              <w:bottom w:val="single" w:color="D9D6CC" w:sz="4"/>
+              <w:right w:val="single" w:color="D9D6CC" w:sz="4"/>
+            </w:tcBorders>
+            <w:tcMar>
+              <w:top w:type="dxa" w:w="70"/>
+              <w:left w:type="dxa" w:w="110"/>
+              <w:bottom w:type="dxa" w:w="70"/>
+              <w:right w:type="dxa" w:w="110"/>
+            </w:tcMar>
+          </w:tcPr>
+          <w:p>
+            <w:pPr>
+              <w:spacing w:after="0" w:line="264"/>
+            </w:pPr>
+            <w:r>
+              <w:rPr>
+                <w:rFonts w:ascii="Calibri" w:cs="Calibri" w:eastAsia="Calibri" w:hAnsi="Calibri"/>
+                <w:b w:val="false"/>
+                <w:bCs w:val="false"/>
+                <w:sz w:val="20"/>
+                <w:szCs w:val="20"/>
+              </w:rPr>
+              <w:t xml:space="preserve">src/lib/backup.ts</w:t>
+            </w:r>
+          </w:p>
+        </w:tc>
+      </w:tr>
+      <w:tr>
+        <w:tc>
+          <w:tcPr>
+            <w:tcW w:type="dxa" w:w="2500"/>
+            <w:tcBorders>
+              <w:top w:val="single" w:color="D9D6CC" w:sz="4"/>
+              <w:left w:val="single" w:color="D9D6CC" w:sz="4"/>
+              <w:bottom w:val="single" w:color="D9D6CC" w:sz="4"/>
+              <w:right w:val="single" w:color="D9D6CC" w:sz="4"/>
+            </w:tcBorders>
+            <w:tcMar>
+              <w:top w:type="dxa" w:w="70"/>
+              <w:left w:type="dxa" w:w="110"/>
+              <w:bottom w:type="dxa" w:w="70"/>
+              <w:right w:type="dxa" w:w="110"/>
+            </w:tcMar>
+          </w:tcPr>
+          <w:p>
+            <w:pPr>
+              <w:spacing w:after="0" w:line="264"/>
+            </w:pPr>
+            <w:r>
+              <w:rPr>
+                <w:rFonts w:ascii="Calibri" w:cs="Calibri" w:eastAsia="Calibri" w:hAnsi="Calibri"/>
+                <w:b w:val="false"/>
+                <w:bCs w:val="false"/>
+                <w:sz w:val="20"/>
+                <w:szCs w:val="20"/>
+              </w:rPr>
               <w:t xml:space="preserve">Model adapter</w:t>
             </w:r>
           </w:p>
@@ -1756,6 +2148,104 @@
                 <w:szCs w:val="20"/>
               </w:rPr>
               <w:t xml:space="preserve">src/lib/llm.ts</w:t>
+            </w:r>
+          </w:p>
+        </w:tc>
+      </w:tr>
+      <w:tr>
+        <w:tc>
+          <w:tcPr>
+            <w:tcW w:type="dxa" w:w="2500"/>
+            <w:tcBorders>
+              <w:top w:val="single" w:color="D9D6CC" w:sz="4"/>
+              <w:left w:val="single" w:color="D9D6CC" w:sz="4"/>
+              <w:bottom w:val="single" w:color="D9D6CC" w:sz="4"/>
+              <w:right w:val="single" w:color="D9D6CC" w:sz="4"/>
+            </w:tcBorders>
+            <w:tcMar>
+              <w:top w:type="dxa" w:w="70"/>
+              <w:left w:type="dxa" w:w="110"/>
+              <w:bottom w:type="dxa" w:w="70"/>
+              <w:right w:type="dxa" w:w="110"/>
+            </w:tcMar>
+          </w:tcPr>
+          <w:p>
+            <w:pPr>
+              <w:spacing w:after="0" w:line="264"/>
+            </w:pPr>
+            <w:r>
+              <w:rPr>
+                <w:rFonts w:ascii="Calibri" w:cs="Calibri" w:eastAsia="Calibri" w:hAnsi="Calibri"/>
+                <w:b w:val="false"/>
+                <w:bCs w:val="false"/>
+                <w:sz w:val="20"/>
+                <w:szCs w:val="20"/>
+              </w:rPr>
+              <w:t xml:space="preserve">Saved progress</w:t>
+            </w:r>
+          </w:p>
+        </w:tc>
+        <w:tc>
+          <w:tcPr>
+            <w:tcW w:type="dxa" w:w="4300"/>
+            <w:tcBorders>
+              <w:top w:val="single" w:color="D9D6CC" w:sz="4"/>
+              <w:left w:val="single" w:color="D9D6CC" w:sz="4"/>
+              <w:bottom w:val="single" w:color="D9D6CC" w:sz="4"/>
+              <w:right w:val="single" w:color="D9D6CC" w:sz="4"/>
+            </w:tcBorders>
+            <w:tcMar>
+              <w:top w:type="dxa" w:w="70"/>
+              <w:left w:type="dxa" w:w="110"/>
+              <w:bottom w:type="dxa" w:w="70"/>
+              <w:right w:type="dxa" w:w="110"/>
+            </w:tcMar>
+          </w:tcPr>
+          <w:p>
+            <w:pPr>
+              <w:spacing w:after="0" w:line="264"/>
+            </w:pPr>
+            <w:r>
+              <w:rPr>
+                <w:rFonts w:ascii="Calibri" w:cs="Calibri" w:eastAsia="Calibri" w:hAnsi="Calibri"/>
+                <w:b w:val="false"/>
+                <w:bCs w:val="false"/>
+                <w:sz w:val="20"/>
+                <w:szCs w:val="20"/>
+              </w:rPr>
+              <w:t xml:space="preserve">Answers, the evidence trail, diagnostic status and any deep-dive in progress are saved in the browser under each roll number. A refresh keeps them signed in on the same page; returning by roll number offers Continue or Start fresh; Switch student signs out without deleting anything.</w:t>
+            </w:r>
+          </w:p>
+        </w:tc>
+        <w:tc>
+          <w:tcPr>
+            <w:tcW w:type="dxa" w:w="2560"/>
+            <w:tcBorders>
+              <w:top w:val="single" w:color="D9D6CC" w:sz="4"/>
+              <w:left w:val="single" w:color="D9D6CC" w:sz="4"/>
+              <w:bottom w:val="single" w:color="D9D6CC" w:sz="4"/>
+              <w:right w:val="single" w:color="D9D6CC" w:sz="4"/>
+            </w:tcBorders>
+            <w:tcMar>
+              <w:top w:type="dxa" w:w="70"/>
+              <w:left w:type="dxa" w:w="110"/>
+              <w:bottom w:type="dxa" w:w="70"/>
+              <w:right w:type="dxa" w:w="110"/>
+            </w:tcMar>
+          </w:tcPr>
+          <w:p>
+            <w:pPr>
+              <w:spacing w:after="0" w:line="264"/>
+            </w:pPr>
+            <w:r>
+              <w:rPr>
+                <w:rFonts w:ascii="Calibri" w:cs="Calibri" w:eastAsia="Calibri" w:hAnsi="Calibri"/>
+                <w:b w:val="false"/>
+                <w:bCs w:val="false"/>
+                <w:sz w:val="20"/>
+                <w:szCs w:val="20"/>
+              </w:rPr>
+              <w:t xml:space="preserve">src/lib/persist.ts, src/screens/Intake.tsx</w:t>
             </w:r>
           </w:p>
         </w:tc>
@@ -1890,7 +2380,7 @@
           <w:sz w:val="26"/>
           <w:szCs w:val="26"/>
         </w:rPr>
-        <w:t xml:space="preserve">4.1 Automated tests (39 passing)</w:t>
+        <w:t xml:space="preserve">4.1 Automated tests (93 passing)</w:t>
       </w:r>
     </w:p>
     <w:tbl>
@@ -2696,6 +3186,594 @@
                 <w:szCs w:val="20"/>
               </w:rPr>
               <w:t xml:space="preserve">Control and discriminating pair present for both trigger topics; trigger topics always end on the pre-written pair even when a live one exists; other topics keep their live pair.</w:t>
+            </w:r>
+          </w:p>
+        </w:tc>
+      </w:tr>
+      <w:tr>
+        <w:tc>
+          <w:tcPr>
+            <w:tcW w:type="dxa" w:w="2900"/>
+            <w:tcBorders>
+              <w:top w:val="single" w:color="D9D6CC" w:sz="4"/>
+              <w:left w:val="single" w:color="D9D6CC" w:sz="4"/>
+              <w:bottom w:val="single" w:color="D9D6CC" w:sz="4"/>
+              <w:right w:val="single" w:color="D9D6CC" w:sz="4"/>
+            </w:tcBorders>
+            <w:tcMar>
+              <w:top w:type="dxa" w:w="70"/>
+              <w:left w:type="dxa" w:w="110"/>
+              <w:bottom w:type="dxa" w:w="70"/>
+              <w:right w:type="dxa" w:w="110"/>
+            </w:tcMar>
+          </w:tcPr>
+          <w:p>
+            <w:pPr>
+              <w:spacing w:after="0" w:line="264"/>
+            </w:pPr>
+            <w:r>
+              <w:rPr>
+                <w:rFonts w:ascii="Calibri" w:cs="Calibri" w:eastAsia="Calibri" w:hAnsi="Calibri"/>
+                <w:b w:val="false"/>
+                <w:bCs w:val="false"/>
+                <w:sz w:val="20"/>
+                <w:szCs w:val="20"/>
+              </w:rPr>
+              <w:t xml:space="preserve">Results grouping and evidence</w:t>
+            </w:r>
+          </w:p>
+        </w:tc>
+        <w:tc>
+          <w:tcPr>
+            <w:tcW w:type="dxa" w:w="1100"/>
+            <w:tcBorders>
+              <w:top w:val="single" w:color="D9D6CC" w:sz="4"/>
+              <w:left w:val="single" w:color="D9D6CC" w:sz="4"/>
+              <w:bottom w:val="single" w:color="D9D6CC" w:sz="4"/>
+              <w:right w:val="single" w:color="D9D6CC" w:sz="4"/>
+            </w:tcBorders>
+            <w:tcMar>
+              <w:top w:type="dxa" w:w="70"/>
+              <w:left w:type="dxa" w:w="110"/>
+              <w:bottom w:type="dxa" w:w="70"/>
+              <w:right w:type="dxa" w:w="110"/>
+            </w:tcMar>
+          </w:tcPr>
+          <w:p>
+            <w:pPr>
+              <w:spacing w:after="0" w:line="264"/>
+            </w:pPr>
+            <w:r>
+              <w:rPr>
+                <w:rFonts w:ascii="Calibri" w:cs="Calibri" w:eastAsia="Calibri" w:hAnsi="Calibri"/>
+                <w:b w:val="false"/>
+                <w:bCs w:val="false"/>
+                <w:sz w:val="20"/>
+                <w:szCs w:val="20"/>
+              </w:rPr>
+              <w:t xml:space="preserve">10</w:t>
+            </w:r>
+          </w:p>
+        </w:tc>
+        <w:tc>
+          <w:tcPr>
+            <w:tcW w:type="dxa" w:w="5360"/>
+            <w:tcBorders>
+              <w:top w:val="single" w:color="D9D6CC" w:sz="4"/>
+              <w:left w:val="single" w:color="D9D6CC" w:sz="4"/>
+              <w:bottom w:val="single" w:color="D9D6CC" w:sz="4"/>
+              <w:right w:val="single" w:color="D9D6CC" w:sz="4"/>
+            </w:tcBorders>
+            <w:tcMar>
+              <w:top w:type="dxa" w:w="70"/>
+              <w:left w:type="dxa" w:w="110"/>
+              <w:bottom w:type="dxa" w:w="70"/>
+              <w:right w:type="dxa" w:w="110"/>
+            </w:tcMar>
+          </w:tcPr>
+          <w:p>
+            <w:pPr>
+              <w:spacing w:after="0" w:line="264"/>
+            </w:pPr>
+            <w:r>
+              <w:rPr>
+                <w:rFonts w:ascii="Calibri" w:cs="Calibri" w:eastAsia="Calibri" w:hAnsi="Calibri"/>
+                <w:b w:val="false"/>
+                <w:bCs w:val="false"/>
+                <w:sz w:val="20"/>
+                <w:szCs w:val="20"/>
+              </w:rPr>
+              <w:t xml:space="preserve">Topics are grouped into needs work, developing, strong, partly checked and unassessed; coverage is the share of topics with any answer, so a one-topic sample shows as 7 percent; confident mistakes sort first, then the topics most others build on; the weakest topic falls back to a developing one; the evidence names the actual question and answer that went wrong and how sure the student was, and reads simply when everything was right.</w:t>
+            </w:r>
+          </w:p>
+        </w:tc>
+      </w:tr>
+      <w:tr>
+        <w:tc>
+          <w:tcPr>
+            <w:tcW w:type="dxa" w:w="2900"/>
+            <w:tcBorders>
+              <w:top w:val="single" w:color="D9D6CC" w:sz="4"/>
+              <w:left w:val="single" w:color="D9D6CC" w:sz="4"/>
+              <w:bottom w:val="single" w:color="D9D6CC" w:sz="4"/>
+              <w:right w:val="single" w:color="D9D6CC" w:sz="4"/>
+            </w:tcBorders>
+            <w:tcMar>
+              <w:top w:type="dxa" w:w="70"/>
+              <w:left w:type="dxa" w:w="110"/>
+              <w:bottom w:type="dxa" w:w="70"/>
+              <w:right w:type="dxa" w:w="110"/>
+            </w:tcMar>
+          </w:tcPr>
+          <w:p>
+            <w:pPr>
+              <w:spacing w:after="0" w:line="264"/>
+            </w:pPr>
+            <w:r>
+              <w:rPr>
+                <w:rFonts w:ascii="Calibri" w:cs="Calibri" w:eastAsia="Calibri" w:hAnsi="Calibri"/>
+                <w:b w:val="false"/>
+                <w:bCs w:val="false"/>
+                <w:sz w:val="20"/>
+                <w:szCs w:val="20"/>
+              </w:rPr>
+              <w:t xml:space="preserve">Student-facing notices</w:t>
+            </w:r>
+          </w:p>
+        </w:tc>
+        <w:tc>
+          <w:tcPr>
+            <w:tcW w:type="dxa" w:w="1100"/>
+            <w:tcBorders>
+              <w:top w:val="single" w:color="D9D6CC" w:sz="4"/>
+              <w:left w:val="single" w:color="D9D6CC" w:sz="4"/>
+              <w:bottom w:val="single" w:color="D9D6CC" w:sz="4"/>
+              <w:right w:val="single" w:color="D9D6CC" w:sz="4"/>
+            </w:tcBorders>
+            <w:tcMar>
+              <w:top w:type="dxa" w:w="70"/>
+              <w:left w:type="dxa" w:w="110"/>
+              <w:bottom w:type="dxa" w:w="70"/>
+              <w:right w:type="dxa" w:w="110"/>
+            </w:tcMar>
+          </w:tcPr>
+          <w:p>
+            <w:pPr>
+              <w:spacing w:after="0" w:line="264"/>
+            </w:pPr>
+            <w:r>
+              <w:rPr>
+                <w:rFonts w:ascii="Calibri" w:cs="Calibri" w:eastAsia="Calibri" w:hAnsi="Calibri"/>
+                <w:b w:val="false"/>
+                <w:bCs w:val="false"/>
+                <w:sz w:val="20"/>
+                <w:szCs w:val="20"/>
+              </w:rPr>
+              <w:t xml:space="preserve">5</w:t>
+            </w:r>
+          </w:p>
+        </w:tc>
+        <w:tc>
+          <w:tcPr>
+            <w:tcW w:type="dxa" w:w="5360"/>
+            <w:tcBorders>
+              <w:top w:val="single" w:color="D9D6CC" w:sz="4"/>
+              <w:left w:val="single" w:color="D9D6CC" w:sz="4"/>
+              <w:bottom w:val="single" w:color="D9D6CC" w:sz="4"/>
+              <w:right w:val="single" w:color="D9D6CC" w:sz="4"/>
+            </w:tcBorders>
+            <w:tcMar>
+              <w:top w:type="dxa" w:w="70"/>
+              <w:left w:type="dxa" w:w="110"/>
+              <w:bottom w:type="dxa" w:w="70"/>
+              <w:right w:type="dxa" w:w="110"/>
+            </w:tcMar>
+          </w:tcPr>
+          <w:p>
+            <w:pPr>
+              <w:spacing w:after="0" w:line="264"/>
+            </w:pPr>
+            <w:r>
+              <w:rPr>
+                <w:rFonts w:ascii="Calibri" w:cs="Calibri" w:eastAsia="Calibri" w:hAnsi="Calibri"/>
+                <w:b w:val="false"/>
+                <w:bCs w:val="false"/>
+                <w:sz w:val="20"/>
+                <w:szCs w:val="20"/>
+              </w:rPr>
+              <w:t xml:space="preserve">A fallback is reported as an amber warning in plain words; every failure reason is translated and never leaks a status code, a provider name or a mention of keys; a returning student is welcomed in green; other notices stay info.</w:t>
+            </w:r>
+          </w:p>
+        </w:tc>
+      </w:tr>
+      <w:tr>
+        <w:tc>
+          <w:tcPr>
+            <w:tcW w:type="dxa" w:w="2900"/>
+            <w:tcBorders>
+              <w:top w:val="single" w:color="D9D6CC" w:sz="4"/>
+              <w:left w:val="single" w:color="D9D6CC" w:sz="4"/>
+              <w:bottom w:val="single" w:color="D9D6CC" w:sz="4"/>
+              <w:right w:val="single" w:color="D9D6CC" w:sz="4"/>
+            </w:tcBorders>
+            <w:tcMar>
+              <w:top w:type="dxa" w:w="70"/>
+              <w:left w:type="dxa" w:w="110"/>
+              <w:bottom w:type="dxa" w:w="70"/>
+              <w:right w:type="dxa" w:w="110"/>
+            </w:tcMar>
+          </w:tcPr>
+          <w:p>
+            <w:pPr>
+              <w:spacing w:after="0" w:line="264"/>
+            </w:pPr>
+            <w:r>
+              <w:rPr>
+                <w:rFonts w:ascii="Calibri" w:cs="Calibri" w:eastAsia="Calibri" w:hAnsi="Calibri"/>
+                <w:b w:val="false"/>
+                <w:bCs w:val="false"/>
+                <w:sz w:val="20"/>
+                <w:szCs w:val="20"/>
+              </w:rPr>
+              <w:t xml:space="preserve">Link tone and unchecked topics</w:t>
+            </w:r>
+          </w:p>
+        </w:tc>
+        <w:tc>
+          <w:tcPr>
+            <w:tcW w:type="dxa" w:w="1100"/>
+            <w:tcBorders>
+              <w:top w:val="single" w:color="D9D6CC" w:sz="4"/>
+              <w:left w:val="single" w:color="D9D6CC" w:sz="4"/>
+              <w:bottom w:val="single" w:color="D9D6CC" w:sz="4"/>
+              <w:right w:val="single" w:color="D9D6CC" w:sz="4"/>
+            </w:tcBorders>
+            <w:tcMar>
+              <w:top w:type="dxa" w:w="70"/>
+              <w:left w:type="dxa" w:w="110"/>
+              <w:bottom w:type="dxa" w:w="70"/>
+              <w:right w:type="dxa" w:w="110"/>
+            </w:tcMar>
+          </w:tcPr>
+          <w:p>
+            <w:pPr>
+              <w:spacing w:after="0" w:line="264"/>
+            </w:pPr>
+            <w:r>
+              <w:rPr>
+                <w:rFonts w:ascii="Calibri" w:cs="Calibri" w:eastAsia="Calibri" w:hAnsi="Calibri"/>
+                <w:b w:val="false"/>
+                <w:bCs w:val="false"/>
+                <w:sz w:val="20"/>
+                <w:szCs w:val="20"/>
+              </w:rPr>
+              <w:t xml:space="preserve">9</w:t>
+            </w:r>
+          </w:p>
+        </w:tc>
+        <w:tc>
+          <w:tcPr>
+            <w:tcW w:type="dxa" w:w="5360"/>
+            <w:tcBorders>
+              <w:top w:val="single" w:color="D9D6CC" w:sz="4"/>
+              <w:left w:val="single" w:color="D9D6CC" w:sz="4"/>
+              <w:bottom w:val="single" w:color="D9D6CC" w:sz="4"/>
+              <w:right w:val="single" w:color="D9D6CC" w:sz="4"/>
+            </w:tcBorders>
+            <w:tcMar>
+              <w:top w:type="dxa" w:w="70"/>
+              <w:left w:type="dxa" w:w="110"/>
+              <w:bottom w:type="dxa" w:w="70"/>
+              <w:right w:type="dxa" w:w="110"/>
+            </w:tcMar>
+          </w:tcPr>
+          <w:p>
+            <w:pPr>
+              <w:spacing w:after="0" w:line="264"/>
+            </w:pPr>
+            <w:r>
+              <w:rPr>
+                <w:rFonts w:ascii="Calibri" w:cs="Calibri" w:eastAsia="Calibri" w:hAnsi="Calibri"/>
+                <w:b w:val="false"/>
+                <w:bCs w:val="false"/>
+                <w:sz w:val="20"/>
+                <w:szCs w:val="20"/>
+              </w:rPr>
+              <w:t xml:space="preserve">A link is a risk chain when both ends need work, a concern when one does, good when both are strong, a watch while developing and idle until known; the tone is symmetric; an unchecked topic has no evidence so it is drawn flat grey with no ring, badge or tint, and becomes an assessed state the moment it has data.</w:t>
+            </w:r>
+          </w:p>
+        </w:tc>
+      </w:tr>
+      <w:tr>
+        <w:tc>
+          <w:tcPr>
+            <w:tcW w:type="dxa" w:w="2900"/>
+            <w:tcBorders>
+              <w:top w:val="single" w:color="D9D6CC" w:sz="4"/>
+              <w:left w:val="single" w:color="D9D6CC" w:sz="4"/>
+              <w:bottom w:val="single" w:color="D9D6CC" w:sz="4"/>
+              <w:right w:val="single" w:color="D9D6CC" w:sz="4"/>
+            </w:tcBorders>
+            <w:tcMar>
+              <w:top w:type="dxa" w:w="70"/>
+              <w:left w:type="dxa" w:w="110"/>
+              <w:bottom w:type="dxa" w:w="70"/>
+              <w:right w:type="dxa" w:w="110"/>
+            </w:tcMar>
+          </w:tcPr>
+          <w:p>
+            <w:pPr>
+              <w:spacing w:after="0" w:line="264"/>
+            </w:pPr>
+            <w:r>
+              <w:rPr>
+                <w:rFonts w:ascii="Calibri" w:cs="Calibri" w:eastAsia="Calibri" w:hAnsi="Calibri"/>
+                <w:b w:val="false"/>
+                <w:bCs w:val="false"/>
+                <w:sz w:val="20"/>
+                <w:szCs w:val="20"/>
+              </w:rPr>
+              <w:t xml:space="preserve">What the map encodes</w:t>
+            </w:r>
+          </w:p>
+        </w:tc>
+        <w:tc>
+          <w:tcPr>
+            <w:tcW w:type="dxa" w:w="1100"/>
+            <w:tcBorders>
+              <w:top w:val="single" w:color="D9D6CC" w:sz="4"/>
+              <w:left w:val="single" w:color="D9D6CC" w:sz="4"/>
+              <w:bottom w:val="single" w:color="D9D6CC" w:sz="4"/>
+              <w:right w:val="single" w:color="D9D6CC" w:sz="4"/>
+            </w:tcBorders>
+            <w:tcMar>
+              <w:top w:type="dxa" w:w="70"/>
+              <w:left w:type="dxa" w:w="110"/>
+              <w:bottom w:type="dxa" w:w="70"/>
+              <w:right w:type="dxa" w:w="110"/>
+            </w:tcMar>
+          </w:tcPr>
+          <w:p>
+            <w:pPr>
+              <w:spacing w:after="0" w:line="264"/>
+            </w:pPr>
+            <w:r>
+              <w:rPr>
+                <w:rFonts w:ascii="Calibri" w:cs="Calibri" w:eastAsia="Calibri" w:hAnsi="Calibri"/>
+                <w:b w:val="false"/>
+                <w:bCs w:val="false"/>
+                <w:sz w:val="20"/>
+                <w:szCs w:val="20"/>
+              </w:rPr>
+              <w:t xml:space="preserve">10</w:t>
+            </w:r>
+          </w:p>
+        </w:tc>
+        <w:tc>
+          <w:tcPr>
+            <w:tcW w:type="dxa" w:w="5360"/>
+            <w:tcBorders>
+              <w:top w:val="single" w:color="D9D6CC" w:sz="4"/>
+              <w:left w:val="single" w:color="D9D6CC" w:sz="4"/>
+              <w:bottom w:val="single" w:color="D9D6CC" w:sz="4"/>
+              <w:right w:val="single" w:color="D9D6CC" w:sz="4"/>
+            </w:tcBorders>
+            <w:tcMar>
+              <w:top w:type="dxa" w:w="70"/>
+              <w:left w:type="dxa" w:w="110"/>
+              <w:bottom w:type="dxa" w:w="70"/>
+              <w:right w:type="dxa" w:w="110"/>
+            </w:tcMar>
+          </w:tcPr>
+          <w:p>
+            <w:pPr>
+              <w:spacing w:after="0" w:line="264"/>
+            </w:pPr>
+            <w:r>
+              <w:rPr>
+                <w:rFonts w:ascii="Calibri" w:cs="Calibri" w:eastAsia="Calibri" w:hAnsi="Calibri"/>
+                <w:b w:val="false"/>
+                <w:bCs w:val="false"/>
+                <w:sz w:val="20"/>
+                <w:szCs w:val="20"/>
+              </w:rPr>
+              <w:t xml:space="preserve">Ring thickness (certainty) is zero with no evidence, grows with more answers, is higher for agreeing answers than mixed ones, and is described in words; node size (importance) makes hubs bigger than leaves and counts indirect dependents; links split into hard (solid) and soft (dashed) with both present; hexagons mark exactly the topics with two or more prerequisites.</w:t>
+            </w:r>
+          </w:p>
+        </w:tc>
+      </w:tr>
+      <w:tr>
+        <w:tc>
+          <w:tcPr>
+            <w:tcW w:type="dxa" w:w="2900"/>
+            <w:tcBorders>
+              <w:top w:val="single" w:color="D9D6CC" w:sz="4"/>
+              <w:left w:val="single" w:color="D9D6CC" w:sz="4"/>
+              <w:bottom w:val="single" w:color="D9D6CC" w:sz="4"/>
+              <w:right w:val="single" w:color="D9D6CC" w:sz="4"/>
+            </w:tcBorders>
+            <w:tcMar>
+              <w:top w:type="dxa" w:w="70"/>
+              <w:left w:type="dxa" w:w="110"/>
+              <w:bottom w:type="dxa" w:w="70"/>
+              <w:right w:type="dxa" w:w="110"/>
+            </w:tcMar>
+          </w:tcPr>
+          <w:p>
+            <w:pPr>
+              <w:spacing w:after="0" w:line="264"/>
+            </w:pPr>
+            <w:r>
+              <w:rPr>
+                <w:rFonts w:ascii="Calibri" w:cs="Calibri" w:eastAsia="Calibri" w:hAnsi="Calibri"/>
+                <w:b w:val="false"/>
+                <w:bCs w:val="false"/>
+                <w:sz w:val="20"/>
+                <w:szCs w:val="20"/>
+              </w:rPr>
+              <w:t xml:space="preserve">Recommendations and states</w:t>
+            </w:r>
+          </w:p>
+        </w:tc>
+        <w:tc>
+          <w:tcPr>
+            <w:tcW w:type="dxa" w:w="1100"/>
+            <w:tcBorders>
+              <w:top w:val="single" w:color="D9D6CC" w:sz="4"/>
+              <w:left w:val="single" w:color="D9D6CC" w:sz="4"/>
+              <w:bottom w:val="single" w:color="D9D6CC" w:sz="4"/>
+              <w:right w:val="single" w:color="D9D6CC" w:sz="4"/>
+            </w:tcBorders>
+            <w:tcMar>
+              <w:top w:type="dxa" w:w="70"/>
+              <w:left w:type="dxa" w:w="110"/>
+              <w:bottom w:type="dxa" w:w="70"/>
+              <w:right w:type="dxa" w:w="110"/>
+            </w:tcMar>
+          </w:tcPr>
+          <w:p>
+            <w:pPr>
+              <w:spacing w:after="0" w:line="264"/>
+            </w:pPr>
+            <w:r>
+              <w:rPr>
+                <w:rFonts w:ascii="Calibri" w:cs="Calibri" w:eastAsia="Calibri" w:hAnsi="Calibri"/>
+                <w:b w:val="false"/>
+                <w:bCs w:val="false"/>
+                <w:sz w:val="20"/>
+                <w:szCs w:val="20"/>
+              </w:rPr>
+              <w:t xml:space="preserve">8</w:t>
+            </w:r>
+          </w:p>
+        </w:tc>
+        <w:tc>
+          <w:tcPr>
+            <w:tcW w:type="dxa" w:w="5360"/>
+            <w:tcBorders>
+              <w:top w:val="single" w:color="D9D6CC" w:sz="4"/>
+              <w:left w:val="single" w:color="D9D6CC" w:sz="4"/>
+              <w:bottom w:val="single" w:color="D9D6CC" w:sz="4"/>
+              <w:right w:val="single" w:color="D9D6CC" w:sz="4"/>
+            </w:tcBorders>
+            <w:tcMar>
+              <w:top w:type="dxa" w:w="70"/>
+              <w:left w:type="dxa" w:w="110"/>
+              <w:bottom w:type="dxa" w:w="70"/>
+              <w:right w:type="dxa" w:w="110"/>
+            </w:tcMar>
+          </w:tcPr>
+          <w:p>
+            <w:pPr>
+              <w:spacing w:after="0" w:line="264"/>
+            </w:pPr>
+            <w:r>
+              <w:rPr>
+                <w:rFonts w:ascii="Calibri" w:cs="Calibri" w:eastAsia="Calibri" w:hAnsi="Calibri"/>
+                <w:b w:val="false"/>
+                <w:bCs w:val="false"/>
+                <w:sz w:val="20"/>
+                <w:szCs w:val="20"/>
+              </w:rPr>
+              <w:t xml:space="preserve">What unlocks what; the recommended next topic (root first, foundations before symptoms, weak before shaky, nothing when all strong); the five student-facing states and their names; no score for an untouched topic.</w:t>
+            </w:r>
+          </w:p>
+        </w:tc>
+      </w:tr>
+      <w:tr>
+        <w:tc>
+          <w:tcPr>
+            <w:tcW w:type="dxa" w:w="2900"/>
+            <w:tcBorders>
+              <w:top w:val="single" w:color="D9D6CC" w:sz="4"/>
+              <w:left w:val="single" w:color="D9D6CC" w:sz="4"/>
+              <w:bottom w:val="single" w:color="D9D6CC" w:sz="4"/>
+              <w:right w:val="single" w:color="D9D6CC" w:sz="4"/>
+            </w:tcBorders>
+            <w:tcMar>
+              <w:top w:type="dxa" w:w="70"/>
+              <w:left w:type="dxa" w:w="110"/>
+              <w:bottom w:type="dxa" w:w="70"/>
+              <w:right w:type="dxa" w:w="110"/>
+            </w:tcMar>
+          </w:tcPr>
+          <w:p>
+            <w:pPr>
+              <w:spacing w:after="0" w:line="264"/>
+            </w:pPr>
+            <w:r>
+              <w:rPr>
+                <w:rFonts w:ascii="Calibri" w:cs="Calibri" w:eastAsia="Calibri" w:hAnsi="Calibri"/>
+                <w:b w:val="false"/>
+                <w:bCs w:val="false"/>
+                <w:sz w:val="20"/>
+                <w:szCs w:val="20"/>
+              </w:rPr>
+              <w:t xml:space="preserve">Saved progress</w:t>
+            </w:r>
+          </w:p>
+        </w:tc>
+        <w:tc>
+          <w:tcPr>
+            <w:tcW w:type="dxa" w:w="1100"/>
+            <w:tcBorders>
+              <w:top w:val="single" w:color="D9D6CC" w:sz="4"/>
+              <w:left w:val="single" w:color="D9D6CC" w:sz="4"/>
+              <w:bottom w:val="single" w:color="D9D6CC" w:sz="4"/>
+              <w:right w:val="single" w:color="D9D6CC" w:sz="4"/>
+            </w:tcBorders>
+            <w:tcMar>
+              <w:top w:type="dxa" w:w="70"/>
+              <w:left w:type="dxa" w:w="110"/>
+              <w:bottom w:type="dxa" w:w="70"/>
+              <w:right w:type="dxa" w:w="110"/>
+            </w:tcMar>
+          </w:tcPr>
+          <w:p>
+            <w:pPr>
+              <w:spacing w:after="0" w:line="264"/>
+            </w:pPr>
+            <w:r>
+              <w:rPr>
+                <w:rFonts w:ascii="Calibri" w:cs="Calibri" w:eastAsia="Calibri" w:hAnsi="Calibri"/>
+                <w:b w:val="false"/>
+                <w:bCs w:val="false"/>
+                <w:sz w:val="20"/>
+                <w:szCs w:val="20"/>
+              </w:rPr>
+              <w:t xml:space="preserve">12</w:t>
+            </w:r>
+          </w:p>
+        </w:tc>
+        <w:tc>
+          <w:tcPr>
+            <w:tcW w:type="dxa" w:w="5360"/>
+            <w:tcBorders>
+              <w:top w:val="single" w:color="D9D6CC" w:sz="4"/>
+              <w:left w:val="single" w:color="D9D6CC" w:sz="4"/>
+              <w:bottom w:val="single" w:color="D9D6CC" w:sz="4"/>
+              <w:right w:val="single" w:color="D9D6CC" w:sz="4"/>
+            </w:tcBorders>
+            <w:tcMar>
+              <w:top w:type="dxa" w:w="70"/>
+              <w:left w:type="dxa" w:w="110"/>
+              <w:bottom w:type="dxa" w:w="70"/>
+              <w:right w:type="dxa" w:w="110"/>
+            </w:tcMar>
+          </w:tcPr>
+          <w:p>
+            <w:pPr>
+              <w:spacing w:after="0" w:line="264"/>
+            </w:pPr>
+            <w:r>
+              <w:rPr>
+                <w:rFonts w:ascii="Calibri" w:cs="Calibri" w:eastAsia="Calibri" w:hAnsi="Calibri"/>
+                <w:b w:val="false"/>
+                <w:bCs w:val="false"/>
+                <w:sz w:val="20"/>
+                <w:szCs w:val="20"/>
+              </w:rPr>
+              <w:t xml:space="preserve">Round trip of beliefs, evidence log and a half-finished deep-dive; roll numbers case-insensitive and students kept apart; last-active tracking; corrupt JSON, wrong version, impossible values, unknown topics, malformed questions and out-of-range positions are repaired or dropped; blocked storage never throws; the stored log is bounded.</w:t>
             </w:r>
           </w:p>
         </w:tc>
@@ -2881,6 +3959,24 @@
           <w:szCs w:val="22"/>
         </w:rPr>
         <w:t xml:space="preserve">Go deeper on Concurrency Control: seven questions ending on the pre-written control and discriminating pair.</w:t>
+      </w:r>
+    </w:p>
+    <w:p>
+      <w:pPr>
+        <w:pStyle w:val="ListParagraph"/>
+        <w:numPr>
+          <w:ilvl w:val="0"/>
+          <w:numId w:val="2"/>
+        </w:numPr>
+        <w:spacing w:after="80" w:line="276"/>
+      </w:pPr>
+      <w:r>
+        <w:rPr>
+          <w:rFonts w:ascii="Calibri" w:cs="Calibri" w:eastAsia="Calibri" w:hAnsi="Calibri"/>
+          <w:sz w:val="22"/>
+          <w:szCs w:val="22"/>
+        </w:rPr>
+        <w:t xml:space="preserve">Saved progress: answered six questions, reloaded (still signed in, same progress); reloaded mid deep-dive (same topic, same question position); switched student and returned by roll number (saved card, Continue restores); a second student sees no saved card; Start fresh erases; corrupt storage does not crash the app.</w:t>
       </w:r>
     </w:p>
     <w:p>
@@ -3378,7 +4474,7 @@
                 <w:sz w:val="20"/>
                 <w:szCs w:val="20"/>
               </w:rPr>
-              <w:t xml:space="preserve">Deliberately deferred. Refreshing the page loses the session.</w:t>
+              <w:t xml:space="preserve">Progress is saved in local storage in the browser, per roll number. It does not follow a student to another browser or device, and clearing site data removes it. There is no server-side account.</w:t>
             </w:r>
           </w:p>
         </w:tc>

</xml_diff>